<commit_message>
Fix costs table: remove leftover empty column
The platform-name column was dropped from the letter table header but
each body row kept an extra empty cell, rendering as a stray empty
column. Body rows now have 4 cells matching the header, and header
widths fill 100%. The Word letter is rebuilt to match (4 fixed-layout
columns, same fill-in fields as the page).

Co-Authored-By: Claude Fable 5 <noreply@anthropic.com>
</commit_message>
<xml_diff>
--- a/khitab_taeed.docx
+++ b/khitab_taeed.docx
@@ -237,25 +237,7 @@
           <w:szCs w:val="24"/>
           <w:rtl/>
         </w:rPr>
-        <w:t xml:space="preserve">اسم المطعم / المتجر: ..............................................................</w:t>
-      </w:r>
-    </w:p>
-    <w:p>
-      <w:pPr>
-        <w:bidi/>
-        <w:spacing w:after="40" w:line="300" w:lineRule="auto"/>
-        <w:jc w:val="right"/>
-      </w:pPr>
-      <w:r>
-        <w:rPr>
-          <w:rFonts w:ascii="Sakkal Majalla" w:cs="Sakkal Majalla" w:eastAsia="Sakkal Majalla" w:hAnsi="Sakkal Majalla"/>
-          <w:b/>
-          <w:bCs/>
-          <w:sz w:val="24"/>
-          <w:szCs w:val="24"/>
-          <w:rtl/>
-        </w:rPr>
-        <w:t xml:space="preserve">رقم الرخصة التجارية: ..............................................................</w:t>
+        <w:t xml:space="preserve">اسم الشركه: ..............................................................</w:t>
       </w:r>
     </w:p>
     <w:p>
@@ -288,6 +270,7 @@
           <w:insideH w:val="single" w:color="auto" w:sz="4"/>
           <w:insideV w:val="single" w:color="auto" w:sz="4"/>
         </w:tblBorders>
+        <w:tblLayout w:type="fixed"/>
       </w:tblPr>
       <w:tblGrid>
         <w:gridCol w:w="550"/>
@@ -296,9 +279,6 @@
         <w:gridCol w:w="2075"/>
       </w:tblGrid>
       <w:tr>
-        <w:trPr>
-          <w:tblHeader/>
-        </w:trPr>
         <w:tc>
           <w:tcPr>
             <w:tcW w:type="dxa" w:w="550"/>

</xml_diff>

<commit_message>
Fix corrupt docx: rebuild archive with correct entry paths
The previous rebuild wrote zip entries with a mangled path prefix, so
Word reported unreadable content. Same document content (owner's letter
shrunk to one page); only the archive packaging is fixed.

Co-Authored-By: Claude Fable 5 <noreply@anthropic.com>
</commit_message>
<xml_diff>
--- a/khitab_taeed.docx
+++ b/khitab_taeed.docx
@@ -1,52 +1,5 @@
 
-<file path=ed/[Content_Types].xml><?xml version="1.0" encoding="utf-8"?>
-<Types xmlns="http://schemas.openxmlformats.org/package/2006/content-types">
-  <Default Extension="rels" ContentType="application/vnd.openxmlformats-package.relationships+xml"/>
-  <Default Extension="xml" ContentType="application/xml"/>
-  <Override PartName="/word/document.xml" ContentType="application/vnd.openxmlformats-officedocument.wordprocessingml.document.main+xml"/>
-  <Override PartName="/word/numbering.xml" ContentType="application/vnd.openxmlformats-officedocument.wordprocessingml.numbering+xml"/>
-  <Override PartName="/word/styles.xml" ContentType="application/vnd.openxmlformats-officedocument.wordprocessingml.styles+xml"/>
-  <Override PartName="/word/settings.xml" ContentType="application/vnd.openxmlformats-officedocument.wordprocessingml.settings+xml"/>
-  <Override PartName="/word/webSettings.xml" ContentType="application/vnd.openxmlformats-officedocument.wordprocessingml.webSettings+xml"/>
-  <Override PartName="/word/fontTable.xml" ContentType="application/vnd.openxmlformats-officedocument.wordprocessingml.fontTable+xml"/>
-  <Override PartName="/word/theme/theme1.xml" ContentType="application/vnd.openxmlformats-officedocument.theme+xml"/>
-  <Override PartName="/docProps/core.xml" ContentType="application/vnd.openxmlformats-package.core-properties+xml"/>
-  <Override PartName="/docProps/app.xml" ContentType="application/vnd.openxmlformats-officedocument.extended-properties+xml"/>
-</Types>
-</file>
-
-<file path=ed/docProps/app.xml><?xml version="1.0" encoding="utf-8"?>
-<Properties xmlns="http://schemas.openxmlformats.org/officeDocument/2006/extended-properties" xmlns:vt="http://schemas.openxmlformats.org/officeDocument/2006/docPropsVTypes">
-  <Template>Normal</Template>
-  <TotalTime>5</TotalTime>
-  <Pages>1</Pages>
-  <Words>477</Words>
-  <Characters>2936</Characters>
-  <Application>Microsoft Office Word</Application>
-  <DocSecurity>0</DocSecurity>
-  <Lines>66</Lines>
-  <Paragraphs>44</Paragraphs>
-  <ScaleCrop>false</ScaleCrop>
-  <Company/>
-  <LinksUpToDate>false</LinksUpToDate>
-  <CharactersWithSpaces>3369</CharactersWithSpaces>
-  <SharedDoc>false</SharedDoc>
-  <HyperlinksChanged>false</HyperlinksChanged>
-  <AppVersion>16.0000</AppVersion>
-</Properties>
-</file>
-
-<file path=ed/docProps/core.xml><?xml version="1.0" encoding="utf-8"?>
-<cp:coreProperties xmlns:cp="http://schemas.openxmlformats.org/package/2006/metadata/core-properties" xmlns:dc="http://purl.org/dc/elements/1.1/" xmlns:dcterms="http://purl.org/dc/terms/" xmlns:dcmitype="http://purl.org/dc/dcmitype/" xmlns:xsi="http://www.w3.org/2001/XMLSchema-instance">
-  <dc:creator>Un-named</dc:creator>
-  <cp:lastModifiedBy>Mohamed Elsayed</cp:lastModifiedBy>
-  <cp:revision>4</cp:revision>
-  <dcterms:created xsi:type="dcterms:W3CDTF">2026-07-16T11:51:00Z</dcterms:created>
-  <dcterms:modified xsi:type="dcterms:W3CDTF">2026-07-16T12:14:00Z</dcterms:modified>
-</cp:coreProperties>
-</file>
-
-<file path=ed/word/document.xml><?xml version="1.0" encoding="utf-8"?>
+<file path=word/document.xml><?xml version="1.0" encoding="utf-8"?>
 <w:document xmlns:wpc="http://schemas.microsoft.com/office/word/2010/wordprocessingCanvas" xmlns:cx="http://schemas.microsoft.com/office/drawing/2014/chartex" xmlns:cx1="http://schemas.microsoft.com/office/drawing/2015/9/8/chartex" xmlns:cx2="http://schemas.microsoft.com/office/drawing/2015/10/21/chartex" xmlns:cx3="http://schemas.microsoft.com/office/drawing/2016/5/9/chartex" xmlns:cx4="http://schemas.microsoft.com/office/drawing/2016/5/10/chartex" xmlns:cx5="http://schemas.microsoft.com/office/drawing/2016/5/11/chartex" xmlns:cx6="http://schemas.microsoft.com/office/drawing/2016/5/12/chartex" xmlns:cx7="http://schemas.microsoft.com/office/drawing/2016/5/13/chartex" xmlns:cx8="http://schemas.microsoft.com/office/drawing/2016/5/14/chartex" xmlns:mc="http://schemas.openxmlformats.org/markup-compatibility/2006" xmlns:aink="http://schemas.microsoft.com/office/drawing/2016/ink" xmlns:am3d="http://schemas.microsoft.com/office/drawing/2017/model3d" xmlns:o="urn:schemas-microsoft-com:office:office" xmlns:oel="http://schemas.microsoft.com/office/2019/extlst" xmlns:r="http://schemas.openxmlformats.org/officeDocument/2006/relationships" xmlns:m="http://schemas.openxmlformats.org/officeDocument/2006/math" xmlns:v="urn:schemas-microsoft-com:vml" xmlns:wp14="http://schemas.microsoft.com/office/word/2010/wordprocessingDrawing" xmlns:wp="http://schemas.openxmlformats.org/drawingml/2006/wordprocessingDrawing" xmlns:w10="urn:schemas-microsoft-com:office:word" xmlns:w="http://schemas.openxmlformats.org/wordprocessingml/2006/main" xmlns:w14="http://schemas.microsoft.com/office/word/2010/wordml" xmlns:w15="http://schemas.microsoft.com/office/word/2012/wordml" xmlns:w16cex="http://schemas.microsoft.com/office/word/2018/wordml/cex" xmlns:w16cid="http://schemas.microsoft.com/office/word/2016/wordml/cid" xmlns:w16="http://schemas.microsoft.com/office/word/2018/wordml" xmlns:w16du="http://schemas.microsoft.com/office/word/2023/wordml/word16du" xmlns:w16sdtdh="http://schemas.microsoft.com/office/word/2020/wordml/sdtdatahash" xmlns:w16sdtfl="http://schemas.microsoft.com/office/word/2024/wordml/sdtformatlock" xmlns:w16se="http://schemas.microsoft.com/office/word/2015/wordml/symex" xmlns:wpg="http://schemas.microsoft.com/office/word/2010/wordprocessingGroup" xmlns:wpi="http://schemas.microsoft.com/office/word/2010/wordprocessingInk" xmlns:wne="http://schemas.microsoft.com/office/word/2006/wordml" xmlns:wps="http://schemas.microsoft.com/office/word/2010/wordprocessingShape" mc:Ignorable="w14 w15 w16se w16cid w16 w16cex w16sdtdh w16sdtfl w16du wp14">
   <w:body>
     <w:p>
@@ -1590,45 +1543,7 @@
 </w:document>
 </file>
 
-<file path=ed/word/fontTable.xml><?xml version="1.0" encoding="utf-8"?>
-<w:fonts xmlns:mc="http://schemas.openxmlformats.org/markup-compatibility/2006" xmlns:r="http://schemas.openxmlformats.org/officeDocument/2006/relationships" xmlns:w="http://schemas.openxmlformats.org/wordprocessingml/2006/main" xmlns:w14="http://schemas.microsoft.com/office/word/2010/wordml" xmlns:w15="http://schemas.microsoft.com/office/word/2012/wordml" xmlns:w16cex="http://schemas.microsoft.com/office/word/2018/wordml/cex" xmlns:w16cid="http://schemas.microsoft.com/office/word/2016/wordml/cid" xmlns:w16="http://schemas.microsoft.com/office/word/2018/wordml" xmlns:w16du="http://schemas.microsoft.com/office/word/2023/wordml/word16du" xmlns:w16sdtdh="http://schemas.microsoft.com/office/word/2020/wordml/sdtdatahash" xmlns:w16sdtfl="http://schemas.microsoft.com/office/word/2024/wordml/sdtformatlock" xmlns:w16se="http://schemas.microsoft.com/office/word/2015/wordml/symex" mc:Ignorable="w14 w15 w16se w16cid w16 w16cex w16sdtdh w16sdtfl w16du">
-  <w:font w:name="Times New Roman">
-    <w:panose1 w:val="02020603050405020304"/>
-    <w:charset w:val="00"/>
-    <w:family w:val="roman"/>
-    <w:pitch w:val="variable"/>
-    <w:sig w:usb0="E0002EFF" w:usb1="C000785B" w:usb2="00000009" w:usb3="00000000" w:csb0="000001FF" w:csb1="00000000"/>
-  </w:font>
-  <w:font w:name="Sakkal Majalla">
-    <w:panose1 w:val="02000000000000000000"/>
-    <w:charset w:val="00"/>
-    <w:family w:val="auto"/>
-    <w:pitch w:val="variable"/>
-    <w:sig w:usb0="A0002027" w:usb1="80000000" w:usb2="00000108" w:usb3="00000000" w:csb0="000000D3" w:csb1="00000000"/>
-  </w:font>
-  <w:font w:name="Aptos Display">
-    <w:charset w:val="00"/>
-    <w:family w:val="swiss"/>
-    <w:pitch w:val="variable"/>
-    <w:sig w:usb0="20000287" w:usb1="00000003" w:usb2="00000000" w:usb3="00000000" w:csb0="0000019F" w:csb1="00000000"/>
-  </w:font>
-  <w:font w:name="Aptos">
-    <w:charset w:val="00"/>
-    <w:family w:val="swiss"/>
-    <w:pitch w:val="variable"/>
-    <w:sig w:usb0="20000287" w:usb1="00000003" w:usb2="00000000" w:usb3="00000000" w:csb0="0000019F" w:csb1="00000000"/>
-  </w:font>
-  <w:font w:name="Arial">
-    <w:panose1 w:val="020B0604020202020204"/>
-    <w:charset w:val="00"/>
-    <w:family w:val="swiss"/>
-    <w:pitch w:val="variable"/>
-    <w:sig w:usb0="E0002EFF" w:usb1="C000785B" w:usb2="00000009" w:usb3="00000000" w:csb0="000001FF" w:csb1="00000000"/>
-  </w:font>
-</w:fonts>
-</file>
-
-<file path=ed/word/numbering.xml><?xml version="1.0" encoding="utf-8"?>
+<file path=word/numbering.xml><?xml version="1.0" encoding="utf-8"?>
 <w:numbering xmlns:wpc="http://schemas.microsoft.com/office/word/2010/wordprocessingCanvas" xmlns:cx="http://schemas.microsoft.com/office/drawing/2014/chartex" xmlns:cx1="http://schemas.microsoft.com/office/drawing/2015/9/8/chartex" xmlns:cx2="http://schemas.microsoft.com/office/drawing/2015/10/21/chartex" xmlns:cx3="http://schemas.microsoft.com/office/drawing/2016/5/9/chartex" xmlns:cx4="http://schemas.microsoft.com/office/drawing/2016/5/10/chartex" xmlns:cx5="http://schemas.microsoft.com/office/drawing/2016/5/11/chartex" xmlns:cx6="http://schemas.microsoft.com/office/drawing/2016/5/12/chartex" xmlns:cx7="http://schemas.microsoft.com/office/drawing/2016/5/13/chartex" xmlns:cx8="http://schemas.microsoft.com/office/drawing/2016/5/14/chartex" xmlns:mc="http://schemas.openxmlformats.org/markup-compatibility/2006" xmlns:aink="http://schemas.microsoft.com/office/drawing/2016/ink" xmlns:am3d="http://schemas.microsoft.com/office/drawing/2017/model3d" xmlns:o="urn:schemas-microsoft-com:office:office" xmlns:oel="http://schemas.microsoft.com/office/2019/extlst" xmlns:r="http://schemas.openxmlformats.org/officeDocument/2006/relationships" xmlns:m="http://schemas.openxmlformats.org/officeDocument/2006/math" xmlns:v="urn:schemas-microsoft-com:vml" xmlns:wp14="http://schemas.microsoft.com/office/word/2010/wordprocessingDrawing" xmlns:wp="http://schemas.openxmlformats.org/drawingml/2006/wordprocessingDrawing" xmlns:w10="urn:schemas-microsoft-com:office:word" xmlns:w="http://schemas.openxmlformats.org/wordprocessingml/2006/main" xmlns:w14="http://schemas.microsoft.com/office/word/2010/wordml" xmlns:w15="http://schemas.microsoft.com/office/word/2012/wordml" xmlns:w16cex="http://schemas.microsoft.com/office/word/2018/wordml/cex" xmlns:w16cid="http://schemas.microsoft.com/office/word/2016/wordml/cid" xmlns:w16="http://schemas.microsoft.com/office/word/2018/wordml" xmlns:w16du="http://schemas.microsoft.com/office/word/2023/wordml/word16du" xmlns:w16sdtdh="http://schemas.microsoft.com/office/word/2020/wordml/sdtdatahash" xmlns:w16sdtfl="http://schemas.microsoft.com/office/word/2024/wordml/sdtformatlock" xmlns:w16se="http://schemas.microsoft.com/office/word/2015/wordml/symex" xmlns:wpg="http://schemas.microsoft.com/office/word/2010/wordprocessingGroup" xmlns:wpi="http://schemas.microsoft.com/office/word/2010/wordprocessingInk" xmlns:wne="http://schemas.microsoft.com/office/word/2006/wordml" xmlns:wps="http://schemas.microsoft.com/office/word/2010/wordprocessingShape" mc:Ignorable="w14 w15 w16se w16cid w16 w16cex w16sdtdh w16sdtfl w16du wp14">
   <w:abstractNum w:abstractNumId="0" w15:restartNumberingAfterBreak="0">
     <w:nsid w:val="7CD123CF"/>
@@ -1725,57 +1640,7 @@
 </w:numbering>
 </file>
 
-<file path=ed/word/settings.xml><?xml version="1.0" encoding="utf-8"?>
-<w:settings xmlns:mc="http://schemas.openxmlformats.org/markup-compatibility/2006" xmlns:o="urn:schemas-microsoft-com:office:office" xmlns:r="http://schemas.openxmlformats.org/officeDocument/2006/relationships" xmlns:m="http://schemas.openxmlformats.org/officeDocument/2006/math" xmlns:v="urn:schemas-microsoft-com:vml" xmlns:w10="urn:schemas-microsoft-com:office:word" xmlns:w="http://schemas.openxmlformats.org/wordprocessingml/2006/main" xmlns:w14="http://schemas.microsoft.com/office/word/2010/wordml" xmlns:w15="http://schemas.microsoft.com/office/word/2012/wordml" xmlns:w16cex="http://schemas.microsoft.com/office/word/2018/wordml/cex" xmlns:w16cid="http://schemas.microsoft.com/office/word/2016/wordml/cid" xmlns:w16="http://schemas.microsoft.com/office/word/2018/wordml" xmlns:w16du="http://schemas.microsoft.com/office/word/2023/wordml/word16du" xmlns:w16sdtdh="http://schemas.microsoft.com/office/word/2020/wordml/sdtdatahash" xmlns:w16sdtfl="http://schemas.microsoft.com/office/word/2024/wordml/sdtformatlock" xmlns:w16se="http://schemas.microsoft.com/office/word/2015/wordml/symex" xmlns:sl="http://schemas.openxmlformats.org/schemaLibrary/2006/main" mc:Ignorable="w14 w15 w16se w16cid w16 w16cex w16sdtdh w16sdtfl w16du">
-  <w:zoom w:percent="100"/>
-  <w:displayBackgroundShape/>
-  <w:proofState w:spelling="clean"/>
-  <w:defaultTabStop w:val="720"/>
-  <w:characterSpacingControl w:val="doNotCompress"/>
-  <w:compat>
-    <w:compatSetting w:name="compatibilityMode" w:uri="http://schemas.microsoft.com/office/word" w:val="15"/>
-    <w:compatSetting w:name="overrideTableStyleFontSizeAndJustification" w:uri="http://schemas.microsoft.com/office/word" w:val="1"/>
-    <w:compatSetting w:name="enableOpenTypeFeatures" w:uri="http://schemas.microsoft.com/office/word" w:val="1"/>
-    <w:compatSetting w:name="doNotFlipMirrorIndents" w:uri="http://schemas.microsoft.com/office/word" w:val="1"/>
-    <w:compatSetting w:name="differentiateMultirowTableHeaders" w:uri="http://schemas.microsoft.com/office/word" w:val="1"/>
-    <w:compatSetting w:name="useWord2013TrackBottomHyphenation" w:uri="http://schemas.microsoft.com/office/word" w:val="1"/>
-  </w:compat>
-  <w:rsids>
-    <w:rsidRoot w:val="00EB4FE6"/>
-    <w:rsid w:val="00801E60"/>
-    <w:rsid w:val="00B45647"/>
-    <w:rsid w:val="00DB2123"/>
-    <w:rsid w:val="00EB4FE6"/>
-  </w:rsids>
-  <m:mathPr>
-    <m:mathFont m:val="Cambria Math"/>
-    <m:brkBin m:val="before"/>
-    <m:brkBinSub m:val="--"/>
-    <m:smallFrac m:val="0"/>
-    <m:dispDef/>
-    <m:lMargin m:val="0"/>
-    <m:rMargin m:val="0"/>
-    <m:defJc m:val="centerGroup"/>
-    <m:wrapIndent m:val="1440"/>
-    <m:intLim m:val="subSup"/>
-    <m:naryLim m:val="undOvr"/>
-  </m:mathPr>
-  <w:themeFontLang w:val="en-US" w:bidi="ar-SA"/>
-  <w:clrSchemeMapping w:bg1="light1" w:t1="dark1" w:bg2="light2" w:t2="dark2" w:accent1="accent1" w:accent2="accent2" w:accent3="accent3" w:accent4="accent4" w:accent5="accent5" w:accent6="accent6" w:hyperlink="hyperlink" w:followedHyperlink="followedHyperlink"/>
-  <w:shapeDefaults>
-    <o:shapedefaults v:ext="edit" spidmax="1026"/>
-    <o:shapelayout v:ext="edit">
-      <o:idmap v:ext="edit" data="1"/>
-    </o:shapelayout>
-  </w:shapeDefaults>
-  <w:decimalSymbol w:val="."/>
-  <w:listSeparator w:val=","/>
-  <w14:docId w14:val="4886016B"/>
-  <w15:docId w15:val="{7B51E253-B433-4005-8ED4-2E72E41F13A4}"/>
-</w:settings>
-</file>
-
-<file path=ed/word/styles.xml><?xml version="1.0" encoding="utf-8"?>
+<file path=word/styles.xml><?xml version="1.0" encoding="utf-8"?>
 <w:styles xmlns:mc="http://schemas.openxmlformats.org/markup-compatibility/2006" xmlns:r="http://schemas.openxmlformats.org/officeDocument/2006/relationships" xmlns:w="http://schemas.openxmlformats.org/wordprocessingml/2006/main" xmlns:w14="http://schemas.microsoft.com/office/word/2010/wordml" xmlns:w15="http://schemas.microsoft.com/office/word/2012/wordml" xmlns:w16cex="http://schemas.microsoft.com/office/word/2018/wordml/cex" xmlns:w16cid="http://schemas.microsoft.com/office/word/2016/wordml/cid" xmlns:w16="http://schemas.microsoft.com/office/word/2018/wordml" xmlns:w16du="http://schemas.microsoft.com/office/word/2023/wordml/word16du" xmlns:w16sdtdh="http://schemas.microsoft.com/office/word/2020/wordml/sdtdatahash" xmlns:w16sdtfl="http://schemas.microsoft.com/office/word/2024/wordml/sdtformatlock" xmlns:w16se="http://schemas.microsoft.com/office/word/2015/wordml/symex" mc:Ignorable="w14 w15 w16se w16cid w16 w16cex w16sdtdh w16sdtfl w16du">
   <w:docDefaults>
     <w:rPrDefault>
@@ -2366,7 +2231,7 @@
 </w:styles>
 </file>
 
-<file path=ed/word/theme/theme1.xml><?xml version="1.0" encoding="utf-8"?>
+<file path=word/theme/theme1.xml><?xml version="1.0" encoding="utf-8"?>
 <a:theme xmlns:a="http://schemas.openxmlformats.org/drawingml/2006/main" name="Office Theme">
   <a:themeElements>
     <a:clrScheme name="Office">
@@ -2679,8 +2544,4 @@
     </a:ext>
   </a:extLst>
 </a:theme>
-</file>
-
-<file path=ed/word/webSettings.xml><?xml version="1.0" encoding="utf-8"?>
-<w:webSettings xmlns:mc="http://schemas.openxmlformats.org/markup-compatibility/2006" xmlns:r="http://schemas.openxmlformats.org/officeDocument/2006/relationships" xmlns:w="http://schemas.openxmlformats.org/wordprocessingml/2006/main" xmlns:w14="http://schemas.microsoft.com/office/word/2010/wordml" xmlns:w15="http://schemas.microsoft.com/office/word/2012/wordml" xmlns:w16cex="http://schemas.microsoft.com/office/word/2018/wordml/cex" xmlns:w16cid="http://schemas.microsoft.com/office/word/2016/wordml/cid" xmlns:w16="http://schemas.microsoft.com/office/word/2018/wordml" xmlns:w16du="http://schemas.microsoft.com/office/word/2023/wordml/word16du" xmlns:w16sdtdh="http://schemas.microsoft.com/office/word/2020/wordml/sdtdatahash" xmlns:w16sdtfl="http://schemas.microsoft.com/office/word/2024/wordml/sdtformatlock" xmlns:w16se="http://schemas.microsoft.com/office/word/2015/wordml/symex" mc:Ignorable="w14 w15 w16se w16cid w16 w16cex w16sdtdh w16sdtfl w16du"/>
 </file>
</xml_diff>

<commit_message>
Slightly increase Word letter font sizes
Co-Authored-By: Claude Fable 5 <noreply@anthropic.com>
</commit_message>
<xml_diff>
--- a/khitab_taeed.docx
+++ b/khitab_taeed.docx
@@ -8,14 +8,14 @@
         <w:spacing w:after="30"/>
         <w:rPr>
           <w:sz w:val="18"/>
-          <w:szCs w:val="15"/>
+          <w:szCs w:val="16"/>
         </w:rPr>
       </w:pPr>
       <w:r>
         <w:rPr>
           <w:rFonts w:ascii="Sakkal Majalla" w:eastAsia="Sakkal Majalla" w:hAnsi="Sakkal Majalla" w:cs="Sakkal Majalla"/>
           <w:sz w:val="18"/>
-          <w:szCs w:val="15"/>
+          <w:szCs w:val="16"/>
           <w:rtl/>
         </w:rPr>
         <w:t xml:space="preserve">التاريخ:   </w:t>
@@ -24,7 +24,7 @@
         <w:rPr>
           <w:rFonts w:ascii="Sakkal Majalla" w:eastAsia="Sakkal Majalla" w:hAnsi="Sakkal Majalla" w:cs="Sakkal Majalla" w:hint="cs"/>
           <w:sz w:val="18"/>
-          <w:szCs w:val="15"/>
+          <w:szCs w:val="16"/>
           <w:rtl/>
         </w:rPr>
         <w:t xml:space="preserve"> </w:t>
@@ -33,7 +33,7 @@
         <w:rPr>
           <w:rFonts w:ascii="Sakkal Majalla" w:eastAsia="Sakkal Majalla" w:hAnsi="Sakkal Majalla" w:cs="Sakkal Majalla"/>
           <w:sz w:val="18"/>
-          <w:szCs w:val="15"/>
+          <w:szCs w:val="16"/>
           <w:rtl/>
         </w:rPr>
         <w:t xml:space="preserve">   /      </w:t>
@@ -42,7 +42,7 @@
         <w:rPr>
           <w:rFonts w:ascii="Sakkal Majalla" w:eastAsia="Sakkal Majalla" w:hAnsi="Sakkal Majalla" w:cs="Sakkal Majalla" w:hint="cs"/>
           <w:sz w:val="18"/>
-          <w:szCs w:val="15"/>
+          <w:szCs w:val="16"/>
           <w:rtl/>
         </w:rPr>
         <w:t xml:space="preserve"> </w:t>
@@ -51,7 +51,7 @@
         <w:rPr>
           <w:rFonts w:ascii="Sakkal Majalla" w:eastAsia="Sakkal Majalla" w:hAnsi="Sakkal Majalla" w:cs="Sakkal Majalla"/>
           <w:sz w:val="18"/>
-          <w:szCs w:val="15"/>
+          <w:szCs w:val="16"/>
           <w:rtl/>
         </w:rPr>
         <w:t>/ 2026م</w:t>
@@ -64,7 +64,7 @@
         <w:jc w:val="center"/>
         <w:rPr>
           <w:sz w:val="18"/>
-          <w:szCs w:val="15"/>
+          <w:szCs w:val="16"/>
         </w:rPr>
       </w:pPr>
       <w:r>
@@ -73,7 +73,7 @@
           <w:b/>
           <w:bCs/>
           <w:sz w:val="28"/>
-          <w:szCs w:val="23"/>
+          <w:szCs w:val="24"/>
           <w:rtl/>
         </w:rPr>
         <w:t>معالي وزير التجارة والصناعة</w:t>
@@ -86,14 +86,14 @@
         <w:jc w:val="center"/>
         <w:rPr>
           <w:sz w:val="18"/>
-          <w:szCs w:val="15"/>
+          <w:szCs w:val="16"/>
         </w:rPr>
       </w:pPr>
       <w:r>
         <w:rPr>
           <w:rFonts w:ascii="Sakkal Majalla" w:eastAsia="Sakkal Majalla" w:hAnsi="Sakkal Majalla" w:cs="Sakkal Majalla"/>
           <w:sz w:val="24"/>
-          <w:szCs w:val="20"/>
+          <w:szCs w:val="21"/>
           <w:rtl/>
         </w:rPr>
         <w:t>السيد/ أسامة خالد عبدالله بودي المحترم</w:t>
@@ -105,7 +105,7 @@
         <w:spacing w:after="40" w:line="270" w:lineRule="auto"/>
         <w:rPr>
           <w:sz w:val="18"/>
-          <w:szCs w:val="15"/>
+          <w:szCs w:val="16"/>
         </w:rPr>
       </w:pPr>
       <w:r>
@@ -114,7 +114,7 @@
           <w:b/>
           <w:bCs/>
           <w:sz w:val="22"/>
-          <w:szCs w:val="18"/>
+          <w:szCs w:val="19"/>
           <w:rtl/>
         </w:rPr>
         <w:t>السلام عليكم ورحمة الله وبركاته،</w:t>
@@ -127,7 +127,7 @@
         <w:jc w:val="both"/>
         <w:rPr>
           <w:sz w:val="18"/>
-          <w:szCs w:val="15"/>
+          <w:szCs w:val="16"/>
         </w:rPr>
       </w:pPr>
       <w:r>
@@ -136,7 +136,7 @@
           <w:b/>
           <w:bCs/>
           <w:sz w:val="22"/>
-          <w:szCs w:val="18"/>
+          <w:szCs w:val="19"/>
           <w:rtl/>
         </w:rPr>
         <w:t>الموضوع: الشكر والتقدير على إصدار القرار الوزاري رقم (109) لسنة 2026 بشأن تنظيم قطاع المنصات والتطبيقات الإلكترونية الوسيطة</w:t>
@@ -149,14 +149,14 @@
         <w:jc w:val="both"/>
         <w:rPr>
           <w:sz w:val="18"/>
-          <w:szCs w:val="15"/>
+          <w:szCs w:val="16"/>
         </w:rPr>
       </w:pPr>
       <w:r>
         <w:rPr>
           <w:rFonts w:ascii="Sakkal Majalla" w:eastAsia="Sakkal Majalla" w:hAnsi="Sakkal Majalla" w:cs="Sakkal Majalla"/>
           <w:sz w:val="22"/>
-          <w:szCs w:val="18"/>
+          <w:szCs w:val="19"/>
           <w:rtl/>
         </w:rPr>
         <w:t>نتقدم إلى معاليكم، نحن الموقّعين أدناه من أصحاب المطاعم والمحال التجارية العاملة في دولة الكويت، بخالص الشكر والتقدير على إصدار القرار الوزاري رقم (109) لسنة 2026 بشأن تنظيم قطاع المنصات والتطبيقات الإلكترونية الوسيطة، والذي نراه خطوة إصلاحية رائدة نحو ترسيخ مبادئ العدالة والشفافية وحماية المنافسة، وتعزيز بيئة الاستثمار في قطاع المطاعم والأغذية الجاهزة.</w:t>
@@ -169,14 +169,14 @@
         <w:jc w:val="both"/>
         <w:rPr>
           <w:sz w:val="18"/>
-          <w:szCs w:val="15"/>
+          <w:szCs w:val="16"/>
         </w:rPr>
       </w:pPr>
       <w:r>
         <w:rPr>
           <w:rFonts w:ascii="Sakkal Majalla" w:eastAsia="Sakkal Majalla" w:hAnsi="Sakkal Majalla" w:cs="Sakkal Majalla"/>
           <w:sz w:val="22"/>
-          <w:szCs w:val="18"/>
+          <w:szCs w:val="19"/>
           <w:rtl/>
         </w:rPr>
         <w:t>لقد واجه القطاع خلال السنوات الماضية تحديات كبيرة نتيجة ارتفاع الرسوم والعمولات وتعدد التكاليف المفروضة من بعض المنصات، الأمر الذي استنزف جزءًا كبيرًا من إيرادات المطاعم والمحال التجارية، وأثّر في قدرتها على التوسع والاستثمار والابتكار، كما انعكس بصورة مباشرة على تكلفة المنتجات التي يتحملها المستهلك.</w:t>
@@ -189,14 +189,14 @@
         <w:jc w:val="both"/>
         <w:rPr>
           <w:sz w:val="18"/>
-          <w:szCs w:val="15"/>
+          <w:szCs w:val="16"/>
         </w:rPr>
       </w:pPr>
       <w:r>
         <w:rPr>
           <w:rFonts w:ascii="Sakkal Majalla" w:eastAsia="Sakkal Majalla" w:hAnsi="Sakkal Majalla" w:cs="Sakkal Majalla"/>
           <w:sz w:val="22"/>
-          <w:szCs w:val="18"/>
+          <w:szCs w:val="19"/>
           <w:rtl/>
         </w:rPr>
         <w:t>وجاء القرار ليضع إطارًا تنظيميًا واضحًا يعيد التوازن إلى العلاقة بين المنصات والمطاعم، من خلال تحديد سقف لمجموع العمولات والرسوم لا يتجاوز 17% من قيمة الطلب عند تولي المنصة خدمة التوصيل، و10% عند تولي المطعم التوصيل بوسائله الخاصة، إلى جانب تعزيز الشفافية، ومنع الممارسات الاحتكارية والتمييزية، وإرساء بيئة تنافسية أكثر عدالة واستقرارًا.</w:t>
@@ -209,14 +209,14 @@
         <w:jc w:val="both"/>
         <w:rPr>
           <w:sz w:val="18"/>
-          <w:szCs w:val="15"/>
+          <w:szCs w:val="16"/>
         </w:rPr>
       </w:pPr>
       <w:r>
         <w:rPr>
           <w:rFonts w:ascii="Sakkal Majalla" w:eastAsia="Sakkal Majalla" w:hAnsi="Sakkal Majalla" w:cs="Sakkal Majalla"/>
           <w:sz w:val="22"/>
-          <w:szCs w:val="18"/>
+          <w:szCs w:val="19"/>
           <w:rtl/>
         </w:rPr>
         <w:t>ونحن على ثقة بأن هذا القرار لن يقتصر أثره على تخفيض التكاليف التشغيلية، بل سيفتح المجال أمام أصحاب المطاعم والمحال التجارية لإعادة استثمار الوفورات في تطوير المنتجات، وتحسين جودة الخدمات، والتوسع وافتتاح فروع جديدة، وتوظيف الكفاءات الوطنية، والاستثمار في التقنيات والابتكار، بما يعزز تنافسية العلامات التجارية الكويتية ويدعم نموها.</w:t>
@@ -229,14 +229,14 @@
         <w:jc w:val="both"/>
         <w:rPr>
           <w:sz w:val="18"/>
-          <w:szCs w:val="15"/>
+          <w:szCs w:val="16"/>
         </w:rPr>
       </w:pPr>
       <w:r>
         <w:rPr>
           <w:rFonts w:ascii="Sakkal Majalla" w:eastAsia="Sakkal Majalla" w:hAnsi="Sakkal Majalla" w:cs="Sakkal Majalla"/>
           <w:sz w:val="22"/>
-          <w:szCs w:val="18"/>
+          <w:szCs w:val="19"/>
           <w:rtl/>
         </w:rPr>
         <w:t>فكل دينار يتم توفيره بفضل هذا التنظيم سيكون فرصة جديدة للاستثمار والتطوير، وليس مجرد خفض في المصروفات، وهو ما سينعكس إيجابًا على جودة الخدمات والأسعار، ويحقق مصلحة المستهلك، ويعزز مساهمة هذا القطاع الحيوي في الاقتصاد الوطني.</w:t>
@@ -250,14 +250,14 @@
         <w:rPr>
           <w:rFonts w:ascii="Sakkal Majalla" w:eastAsia="Sakkal Majalla" w:hAnsi="Sakkal Majalla" w:cs="Sakkal Majalla"/>
           <w:sz w:val="22"/>
-          <w:szCs w:val="18"/>
+          <w:szCs w:val="19"/>
         </w:rPr>
       </w:pPr>
       <w:r>
         <w:rPr>
           <w:rFonts w:ascii="Sakkal Majalla" w:eastAsia="Sakkal Majalla" w:hAnsi="Sakkal Majalla" w:cs="Sakkal Majalla"/>
           <w:sz w:val="22"/>
-          <w:szCs w:val="18"/>
+          <w:szCs w:val="19"/>
           <w:rtl/>
         </w:rPr>
         <w:t>وإيمانًا منا بأهمية دعم جهود الوزارة، نرفق لمعاليكم بيانًا يوضح الرسوم والتكاليف التي كانت تتحملها المطاعم والمحال التجارية قبل صدور القرار، بما يسهم في توثيق واقع القطاع وقياس الأثر الإيجابي لهذا التنظيم.</w:t>
@@ -270,14 +270,14 @@
         <w:jc w:val="both"/>
         <w:rPr>
           <w:sz w:val="18"/>
-          <w:szCs w:val="15"/>
+          <w:szCs w:val="16"/>
         </w:rPr>
       </w:pPr>
       <w:r>
         <w:rPr>
           <w:rFonts w:ascii="Sakkal Majalla" w:eastAsia="Sakkal Majalla" w:hAnsi="Sakkal Majalla" w:cs="Sakkal Majalla"/>
           <w:sz w:val="22"/>
-          <w:szCs w:val="18"/>
+          <w:szCs w:val="19"/>
           <w:rtl/>
         </w:rPr>
         <w:t>ختامًا، نجدد لمعاليكم خالص الشكر والتقدير على هذا القرار الإصلاحي، الذي يمثل دعمًا مباشرًا للمستثمر الكويتي، ويعزز ريادة الأعمال، ويرسخ بيئة استثمارية أكثر عدالة واستدامة، بما يواكب تطلعات دولة الكويت نحو اقتصاد أكثر تنافسية وازدهارًا.</w:t>
@@ -292,7 +292,7 @@
         <w:spacing w:before="30" w:after="30"/>
         <w:rPr>
           <w:sz w:val="18"/>
-          <w:szCs w:val="15"/>
+          <w:szCs w:val="16"/>
         </w:rPr>
       </w:pPr>
       <w:r>
@@ -302,7 +302,7 @@
           <w:bCs/>
           <w:color w:val="00693E"/>
           <w:sz w:val="24"/>
-          <w:szCs w:val="20"/>
+          <w:szCs w:val="21"/>
           <w:rtl/>
         </w:rPr>
         <w:t xml:space="preserve">واقع التكاليف الحالية التي يتحملها المطعم </w:t>
@@ -314,7 +314,7 @@
         <w:spacing w:after="20" w:line="270" w:lineRule="auto"/>
         <w:rPr>
           <w:sz w:val="18"/>
-          <w:szCs w:val="15"/>
+          <w:szCs w:val="16"/>
         </w:rPr>
       </w:pPr>
       <w:r>
@@ -323,7 +323,7 @@
           <w:b/>
           <w:bCs/>
           <w:sz w:val="22"/>
-          <w:szCs w:val="18"/>
+          <w:szCs w:val="19"/>
           <w:rtl/>
         </w:rPr>
         <w:t xml:space="preserve">اسم  </w:t>
@@ -334,7 +334,7 @@
           <w:b/>
           <w:bCs/>
           <w:sz w:val="22"/>
-          <w:szCs w:val="18"/>
+          <w:szCs w:val="19"/>
           <w:rtl/>
           <w:lang w:bidi="ar-KW"/>
         </w:rPr>
@@ -346,7 +346,7 @@
           <w:b/>
           <w:bCs/>
           <w:sz w:val="22"/>
-          <w:szCs w:val="18"/>
+          <w:szCs w:val="19"/>
           <w:rtl/>
         </w:rPr>
         <w:t>: ..............................................................</w:t>
@@ -358,7 +358,7 @@
         <w:spacing w:after="20" w:line="270" w:lineRule="auto"/>
         <w:rPr>
           <w:sz w:val="18"/>
-          <w:szCs w:val="15"/>
+          <w:szCs w:val="16"/>
         </w:rPr>
       </w:pPr>
       <w:r>
@@ -367,7 +367,7 @@
           <w:b/>
           <w:bCs/>
           <w:sz w:val="22"/>
-          <w:szCs w:val="18"/>
+          <w:szCs w:val="19"/>
           <w:rtl/>
         </w:rPr>
         <w:t>رقم الرخصة التجارية: ..............................................................</w:t>
@@ -425,7 +425,7 @@
               <w:jc w:val="center"/>
               <w:rPr>
                 <w:sz w:val="18"/>
-                <w:szCs w:val="15"/>
+                <w:szCs w:val="16"/>
               </w:rPr>
             </w:pPr>
             <w:r>
@@ -434,7 +434,7 @@
                 <w:b/>
                 <w:bCs/>
                 <w:sz w:val="16"/>
-                <w:szCs w:val="13"/>
+                <w:szCs w:val="14"/>
                 <w:rtl/>
               </w:rPr>
               <w:t>م</w:t>
@@ -459,7 +459,7 @@
               <w:jc w:val="center"/>
               <w:rPr>
                 <w:sz w:val="18"/>
-                <w:szCs w:val="15"/>
+                <w:szCs w:val="16"/>
               </w:rPr>
             </w:pPr>
             <w:r>
@@ -468,7 +468,7 @@
                 <w:b/>
                 <w:bCs/>
                 <w:sz w:val="16"/>
-                <w:szCs w:val="13"/>
+                <w:szCs w:val="14"/>
                 <w:rtl/>
               </w:rPr>
               <w:t>البند</w:t>
@@ -493,7 +493,7 @@
               <w:jc w:val="center"/>
               <w:rPr>
                 <w:sz w:val="18"/>
-                <w:szCs w:val="15"/>
+                <w:szCs w:val="16"/>
               </w:rPr>
             </w:pPr>
             <w:r>
@@ -502,7 +502,7 @@
                 <w:b/>
                 <w:bCs/>
                 <w:sz w:val="16"/>
-                <w:szCs w:val="13"/>
+                <w:szCs w:val="14"/>
                 <w:rtl/>
               </w:rPr>
               <w:t>المبلغ الشهري التقريبي (د.ك)</w:t>
@@ -527,7 +527,7 @@
               <w:jc w:val="center"/>
               <w:rPr>
                 <w:sz w:val="18"/>
-                <w:szCs w:val="15"/>
+                <w:szCs w:val="16"/>
               </w:rPr>
             </w:pPr>
             <w:r>
@@ -536,7 +536,7 @@
                 <w:b/>
                 <w:bCs/>
                 <w:sz w:val="16"/>
-                <w:szCs w:val="13"/>
+                <w:szCs w:val="14"/>
                 <w:rtl/>
               </w:rPr>
               <w:t>النسبة من قيمة الطلب (%)</w:t>
@@ -568,14 +568,14 @@
               <w:jc w:val="center"/>
               <w:rPr>
                 <w:sz w:val="18"/>
-                <w:szCs w:val="15"/>
+                <w:szCs w:val="16"/>
               </w:rPr>
             </w:pPr>
             <w:r>
               <w:rPr>
                 <w:rFonts w:ascii="Sakkal Majalla" w:eastAsia="Sakkal Majalla" w:hAnsi="Sakkal Majalla" w:cs="Sakkal Majalla"/>
                 <w:sz w:val="18"/>
-                <w:szCs w:val="15"/>
+                <w:szCs w:val="16"/>
                 <w:rtl/>
               </w:rPr>
               <w:t>1</w:t>
@@ -598,14 +598,14 @@
               <w:bidi/>
               <w:rPr>
                 <w:sz w:val="18"/>
-                <w:szCs w:val="15"/>
+                <w:szCs w:val="16"/>
               </w:rPr>
             </w:pPr>
             <w:r>
               <w:rPr>
                 <w:rFonts w:ascii="Sakkal Majalla" w:eastAsia="Sakkal Majalla" w:hAnsi="Sakkal Majalla" w:cs="Sakkal Majalla"/>
                 <w:sz w:val="18"/>
-                <w:szCs w:val="15"/>
+                <w:szCs w:val="16"/>
                 <w:rtl/>
               </w:rPr>
               <w:t>العمولات (Commissions)</w:t>
@@ -629,7 +629,7 @@
               <w:jc w:val="right"/>
               <w:rPr>
                 <w:sz w:val="18"/>
-                <w:szCs w:val="15"/>
+                <w:szCs w:val="16"/>
               </w:rPr>
             </w:pPr>
           </w:p>
@@ -651,7 +651,7 @@
               <w:jc w:val="right"/>
               <w:rPr>
                 <w:sz w:val="18"/>
-                <w:szCs w:val="15"/>
+                <w:szCs w:val="16"/>
               </w:rPr>
             </w:pPr>
           </w:p>
@@ -681,14 +681,14 @@
               <w:jc w:val="center"/>
               <w:rPr>
                 <w:sz w:val="18"/>
-                <w:szCs w:val="15"/>
+                <w:szCs w:val="16"/>
               </w:rPr>
             </w:pPr>
             <w:r>
               <w:rPr>
                 <w:rFonts w:ascii="Sakkal Majalla" w:eastAsia="Sakkal Majalla" w:hAnsi="Sakkal Majalla" w:cs="Sakkal Majalla"/>
                 <w:sz w:val="18"/>
-                <w:szCs w:val="15"/>
+                <w:szCs w:val="16"/>
                 <w:rtl/>
               </w:rPr>
               <w:t>2</w:t>
@@ -711,14 +711,14 @@
               <w:bidi/>
               <w:rPr>
                 <w:sz w:val="18"/>
-                <w:szCs w:val="15"/>
+                <w:szCs w:val="16"/>
               </w:rPr>
             </w:pPr>
             <w:r>
               <w:rPr>
                 <w:rFonts w:ascii="Sakkal Majalla" w:eastAsia="Sakkal Majalla" w:hAnsi="Sakkal Majalla" w:cs="Sakkal Majalla"/>
                 <w:sz w:val="18"/>
-                <w:szCs w:val="15"/>
+                <w:szCs w:val="16"/>
                 <w:rtl/>
               </w:rPr>
               <w:t>الإيرادات غير العمولية (NCR) — أدوات الإعلان والترويج والظهور المميز داخل المنصة</w:t>
@@ -742,7 +742,7 @@
               <w:jc w:val="right"/>
               <w:rPr>
                 <w:sz w:val="18"/>
-                <w:szCs w:val="15"/>
+                <w:szCs w:val="16"/>
               </w:rPr>
             </w:pPr>
           </w:p>
@@ -764,7 +764,7 @@
               <w:jc w:val="right"/>
               <w:rPr>
                 <w:sz w:val="18"/>
-                <w:szCs w:val="15"/>
+                <w:szCs w:val="16"/>
               </w:rPr>
             </w:pPr>
           </w:p>
@@ -794,14 +794,14 @@
               <w:jc w:val="center"/>
               <w:rPr>
                 <w:sz w:val="18"/>
-                <w:szCs w:val="15"/>
+                <w:szCs w:val="16"/>
               </w:rPr>
             </w:pPr>
             <w:r>
               <w:rPr>
                 <w:rFonts w:ascii="Sakkal Majalla" w:eastAsia="Sakkal Majalla" w:hAnsi="Sakkal Majalla" w:cs="Sakkal Majalla"/>
                 <w:sz w:val="18"/>
-                <w:szCs w:val="15"/>
+                <w:szCs w:val="16"/>
                 <w:rtl/>
               </w:rPr>
               <w:t>3</w:t>
@@ -824,14 +824,14 @@
               <w:bidi/>
               <w:rPr>
                 <w:sz w:val="18"/>
-                <w:szCs w:val="15"/>
+                <w:szCs w:val="16"/>
               </w:rPr>
             </w:pPr>
             <w:r>
               <w:rPr>
                 <w:rFonts w:ascii="Sakkal Majalla" w:eastAsia="Sakkal Majalla" w:hAnsi="Sakkal Majalla" w:cs="Sakkal Majalla"/>
                 <w:sz w:val="18"/>
-                <w:szCs w:val="15"/>
+                <w:szCs w:val="16"/>
                 <w:rtl/>
               </w:rPr>
               <w:t>رسوم بطاقات الائتمان والخصم (Credit/Debit Card Fees)</w:t>
@@ -855,7 +855,7 @@
               <w:jc w:val="right"/>
               <w:rPr>
                 <w:sz w:val="18"/>
-                <w:szCs w:val="15"/>
+                <w:szCs w:val="16"/>
               </w:rPr>
             </w:pPr>
           </w:p>
@@ -877,7 +877,7 @@
               <w:jc w:val="right"/>
               <w:rPr>
                 <w:sz w:val="18"/>
-                <w:szCs w:val="15"/>
+                <w:szCs w:val="16"/>
               </w:rPr>
             </w:pPr>
           </w:p>
@@ -907,14 +907,14 @@
               <w:jc w:val="center"/>
               <w:rPr>
                 <w:sz w:val="18"/>
-                <w:szCs w:val="15"/>
+                <w:szCs w:val="16"/>
               </w:rPr>
             </w:pPr>
             <w:r>
               <w:rPr>
                 <w:rFonts w:ascii="Sakkal Majalla" w:eastAsia="Sakkal Majalla" w:hAnsi="Sakkal Majalla" w:cs="Sakkal Majalla"/>
                 <w:sz w:val="18"/>
-                <w:szCs w:val="15"/>
+                <w:szCs w:val="16"/>
                 <w:rtl/>
               </w:rPr>
               <w:t>4</w:t>
@@ -937,14 +937,14 @@
               <w:bidi/>
               <w:rPr>
                 <w:sz w:val="18"/>
-                <w:szCs w:val="15"/>
+                <w:szCs w:val="16"/>
               </w:rPr>
             </w:pPr>
             <w:r>
               <w:rPr>
                 <w:rFonts w:ascii="Sakkal Majalla" w:eastAsia="Sakkal Majalla" w:hAnsi="Sakkal Majalla" w:cs="Sakkal Majalla"/>
                 <w:sz w:val="18"/>
-                <w:szCs w:val="15"/>
+                <w:szCs w:val="16"/>
                 <w:rtl/>
               </w:rPr>
               <w:t>رسوم عروض التوصيل المجاني (Free Delivery Fees)</w:t>
@@ -968,7 +968,7 @@
               <w:jc w:val="right"/>
               <w:rPr>
                 <w:sz w:val="18"/>
-                <w:szCs w:val="15"/>
+                <w:szCs w:val="16"/>
               </w:rPr>
             </w:pPr>
           </w:p>
@@ -990,7 +990,7 @@
               <w:jc w:val="right"/>
               <w:rPr>
                 <w:sz w:val="18"/>
-                <w:szCs w:val="15"/>
+                <w:szCs w:val="16"/>
               </w:rPr>
             </w:pPr>
           </w:p>
@@ -1020,14 +1020,14 @@
               <w:jc w:val="center"/>
               <w:rPr>
                 <w:sz w:val="18"/>
-                <w:szCs w:val="15"/>
+                <w:szCs w:val="16"/>
               </w:rPr>
             </w:pPr>
             <w:r>
               <w:rPr>
                 <w:rFonts w:ascii="Sakkal Majalla" w:eastAsia="Sakkal Majalla" w:hAnsi="Sakkal Majalla" w:cs="Sakkal Majalla"/>
                 <w:sz w:val="18"/>
-                <w:szCs w:val="15"/>
+                <w:szCs w:val="16"/>
                 <w:rtl/>
               </w:rPr>
               <w:t>5</w:t>
@@ -1050,14 +1050,14 @@
               <w:bidi/>
               <w:rPr>
                 <w:sz w:val="18"/>
-                <w:szCs w:val="15"/>
+                <w:szCs w:val="16"/>
               </w:rPr>
             </w:pPr>
             <w:r>
               <w:rPr>
                 <w:rFonts w:ascii="Sakkal Majalla" w:eastAsia="Sakkal Majalla" w:hAnsi="Sakkal Majalla" w:cs="Sakkal Majalla"/>
                 <w:sz w:val="18"/>
-                <w:szCs w:val="15"/>
+                <w:szCs w:val="16"/>
                 <w:rtl/>
               </w:rPr>
               <w:t>غرامات معدل تواصل العملاء بشأن الطلبات (Contact Rate Fines)</w:t>
@@ -1081,7 +1081,7 @@
               <w:jc w:val="right"/>
               <w:rPr>
                 <w:sz w:val="18"/>
-                <w:szCs w:val="15"/>
+                <w:szCs w:val="16"/>
               </w:rPr>
             </w:pPr>
           </w:p>
@@ -1103,7 +1103,7 @@
               <w:jc w:val="right"/>
               <w:rPr>
                 <w:sz w:val="18"/>
-                <w:szCs w:val="15"/>
+                <w:szCs w:val="16"/>
               </w:rPr>
             </w:pPr>
           </w:p>
@@ -1133,14 +1133,14 @@
               <w:jc w:val="center"/>
               <w:rPr>
                 <w:sz w:val="18"/>
-                <w:szCs w:val="15"/>
+                <w:szCs w:val="16"/>
               </w:rPr>
             </w:pPr>
             <w:r>
               <w:rPr>
                 <w:rFonts w:ascii="Sakkal Majalla" w:eastAsia="Sakkal Majalla" w:hAnsi="Sakkal Majalla" w:cs="Sakkal Majalla"/>
                 <w:sz w:val="18"/>
-                <w:szCs w:val="15"/>
+                <w:szCs w:val="16"/>
                 <w:rtl/>
               </w:rPr>
               <w:t>6</w:t>
@@ -1163,14 +1163,14 @@
               <w:bidi/>
               <w:rPr>
                 <w:sz w:val="18"/>
-                <w:szCs w:val="15"/>
+                <w:szCs w:val="16"/>
               </w:rPr>
             </w:pPr>
             <w:r>
               <w:rPr>
                 <w:rFonts w:ascii="Sakkal Majalla" w:eastAsia="Sakkal Majalla" w:hAnsi="Sakkal Majalla" w:cs="Sakkal Majalla"/>
                 <w:sz w:val="18"/>
-                <w:szCs w:val="15"/>
+                <w:szCs w:val="16"/>
                 <w:rtl/>
               </w:rPr>
               <w:t>العروض الممولة بالمشاركة (Co-funded Offers) — حصة المطعم من الخصومات</w:t>
@@ -1194,7 +1194,7 @@
               <w:jc w:val="right"/>
               <w:rPr>
                 <w:sz w:val="18"/>
-                <w:szCs w:val="15"/>
+                <w:szCs w:val="16"/>
               </w:rPr>
             </w:pPr>
           </w:p>
@@ -1216,7 +1216,7 @@
               <w:jc w:val="right"/>
               <w:rPr>
                 <w:sz w:val="18"/>
-                <w:szCs w:val="15"/>
+                <w:szCs w:val="16"/>
               </w:rPr>
             </w:pPr>
           </w:p>
@@ -1246,14 +1246,14 @@
               <w:jc w:val="center"/>
               <w:rPr>
                 <w:sz w:val="18"/>
-                <w:szCs w:val="15"/>
+                <w:szCs w:val="16"/>
               </w:rPr>
             </w:pPr>
             <w:r>
               <w:rPr>
                 <w:rFonts w:ascii="Sakkal Majalla" w:eastAsia="Sakkal Majalla" w:hAnsi="Sakkal Majalla" w:cs="Sakkal Majalla"/>
                 <w:sz w:val="18"/>
-                <w:szCs w:val="15"/>
+                <w:szCs w:val="16"/>
                 <w:rtl/>
               </w:rPr>
               <w:t>7</w:t>
@@ -1276,14 +1276,14 @@
               <w:bidi/>
               <w:rPr>
                 <w:sz w:val="18"/>
-                <w:szCs w:val="15"/>
+                <w:szCs w:val="16"/>
               </w:rPr>
             </w:pPr>
             <w:r>
               <w:rPr>
                 <w:rFonts w:ascii="Sakkal Majalla" w:eastAsia="Sakkal Majalla" w:hAnsi="Sakkal Majalla" w:cs="Sakkal Majalla"/>
                 <w:sz w:val="18"/>
-                <w:szCs w:val="15"/>
+                <w:szCs w:val="16"/>
                 <w:rtl/>
               </w:rPr>
               <w:t>مصاريف أخرى (يرجى التحديد): ...........................</w:t>
@@ -1307,7 +1307,7 @@
               <w:jc w:val="right"/>
               <w:rPr>
                 <w:sz w:val="18"/>
-                <w:szCs w:val="15"/>
+                <w:szCs w:val="16"/>
               </w:rPr>
             </w:pPr>
           </w:p>
@@ -1329,7 +1329,7 @@
               <w:jc w:val="right"/>
               <w:rPr>
                 <w:sz w:val="18"/>
-                <w:szCs w:val="15"/>
+                <w:szCs w:val="16"/>
               </w:rPr>
             </w:pPr>
           </w:p>
@@ -1360,7 +1360,7 @@
               <w:jc w:val="right"/>
               <w:rPr>
                 <w:sz w:val="18"/>
-                <w:szCs w:val="15"/>
+                <w:szCs w:val="16"/>
               </w:rPr>
             </w:pPr>
           </w:p>
@@ -1382,7 +1382,7 @@
               <w:bidi/>
               <w:rPr>
                 <w:sz w:val="18"/>
-                <w:szCs w:val="15"/>
+                <w:szCs w:val="16"/>
               </w:rPr>
             </w:pPr>
             <w:r>
@@ -1391,7 +1391,7 @@
                 <w:b/>
                 <w:bCs/>
                 <w:sz w:val="18"/>
-                <w:szCs w:val="15"/>
+                <w:szCs w:val="16"/>
                 <w:rtl/>
               </w:rPr>
               <w:t>الإجمالي التقريبي</w:t>
@@ -1416,7 +1416,7 @@
               <w:jc w:val="right"/>
               <w:rPr>
                 <w:sz w:val="18"/>
-                <w:szCs w:val="15"/>
+                <w:szCs w:val="16"/>
               </w:rPr>
             </w:pPr>
           </w:p>
@@ -1439,7 +1439,7 @@
               <w:jc w:val="right"/>
               <w:rPr>
                 <w:sz w:val="18"/>
-                <w:szCs w:val="15"/>
+                <w:szCs w:val="16"/>
               </w:rPr>
             </w:pPr>
           </w:p>
@@ -1453,7 +1453,7 @@
         <w:jc w:val="right"/>
         <w:rPr>
           <w:sz w:val="18"/>
-          <w:szCs w:val="15"/>
+          <w:szCs w:val="16"/>
         </w:rPr>
       </w:pPr>
       <w:r>
@@ -1461,7 +1461,7 @@
           <w:rFonts w:ascii="Sakkal Majalla" w:eastAsia="Sakkal Majalla" w:hAnsi="Sakkal Majalla" w:cs="Sakkal Majalla"/>
           <w:color w:val="555555"/>
           <w:sz w:val="16"/>
-          <w:szCs w:val="13"/>
+          <w:szCs w:val="14"/>
           <w:rtl/>
         </w:rPr>
         <w:t>ملاحظة: تعبئة المبالغ اختيارية، ويجوز إدراجها كنسبة مئوية من قيمة الطلب أو كمتوسط شهري تقريبي. المعلومات الواردة أعلاه قُدمت طوعًا من صاحب الشأن إلى الجهة الحكومية المختصة لأغراض دعم الرقابة التنظيمية.</w:t>
@@ -1474,7 +1474,7 @@
         <w:jc w:val="right"/>
         <w:rPr>
           <w:sz w:val="18"/>
-          <w:szCs w:val="15"/>
+          <w:szCs w:val="16"/>
         </w:rPr>
       </w:pPr>
       <w:r>
@@ -1483,7 +1483,7 @@
           <w:b/>
           <w:bCs/>
           <w:sz w:val="22"/>
-          <w:szCs w:val="18"/>
+          <w:szCs w:val="19"/>
           <w:rtl/>
         </w:rPr>
         <w:t>وتفضلوا بقبول فائق الاحترام والتقدير.</w:t>
@@ -1496,7 +1496,7 @@
         <w:jc w:val="right"/>
         <w:rPr>
           <w:sz w:val="18"/>
-          <w:szCs w:val="15"/>
+          <w:szCs w:val="16"/>
         </w:rPr>
       </w:pPr>
       <w:r>
@@ -1505,7 +1505,7 @@
           <w:b/>
           <w:bCs/>
           <w:sz w:val="22"/>
-          <w:szCs w:val="18"/>
+          <w:szCs w:val="19"/>
           <w:rtl/>
         </w:rPr>
         <w:t>اسم المفوّض بالتوقيع وصفته: ..............................................................</w:t>
@@ -1518,7 +1518,7 @@
         <w:jc w:val="right"/>
         <w:rPr>
           <w:sz w:val="18"/>
-          <w:szCs w:val="15"/>
+          <w:szCs w:val="16"/>
         </w:rPr>
       </w:pPr>
       <w:r>
@@ -1527,7 +1527,7 @@
           <w:b/>
           <w:bCs/>
           <w:sz w:val="22"/>
-          <w:szCs w:val="18"/>
+          <w:szCs w:val="19"/>
           <w:rtl/>
         </w:rPr>
         <w:t>التاريخ:      /      / 2026م          التوقيع: ..................................          الختم الرسمي للمطعم / المتجر</w:t>

</xml_diff>